<commit_message>
Update HarvestHub SRS report
</commit_message>
<xml_diff>
--- a/Document/SRS Report.docx
+++ b/Document/SRS Report.docx
@@ -24,21 +24,8 @@
           <w:szCs w:val="30"/>
           <w:u w:val="single"/>
         </w:rPr>
-        <w:t xml:space="preserve">GITHUB </w:t>
-      </w:r>
-      <w:proofErr w:type="gramStart"/>
-      <w:r>
-        <w:rPr>
-          <w:b/>
-          <w:bCs/>
-          <w:color w:val="1F5C3A"/>
-          <w:sz w:val="30"/>
-          <w:szCs w:val="30"/>
-          <w:u w:val="single"/>
-        </w:rPr>
-        <w:t>REPO:-</w:t>
-      </w:r>
-      <w:proofErr w:type="gramEnd"/>
+        <w:t>GITHUB REPO:-</w:t>
+      </w:r>
       <w:r>
         <w:rPr>
           <w:u w:val="single"/>
@@ -450,7 +437,6 @@
           </w:tcPr>
           <w:p>
             <w:proofErr w:type="spellStart"/>
-            <w:proofErr w:type="gramStart"/>
             <w:r>
               <w:rPr>
                 <w:sz w:val="20"/>
@@ -459,7 +445,6 @@
               <w:t>com.hcl.havrvesthub</w:t>
             </w:r>
             <w:proofErr w:type="spellEnd"/>
-            <w:proofErr w:type="gramEnd"/>
           </w:p>
         </w:tc>
       </w:tr>
@@ -1433,7 +1418,14 @@
                 <w:rStyle w:val="Hyperlink"/>
                 <w:noProof/>
               </w:rPr>
-              <w:t>4.1 Entity: Farms</w:t>
+              <w:t>4.1 Entity: Farm</w:t>
+            </w:r>
+            <w:r>
+              <w:rPr>
+                <w:rStyle w:val="Hyperlink"/>
+                <w:noProof/>
+              </w:rPr>
+              <w:t>Profile</w:t>
             </w:r>
             <w:r>
               <w:rPr>
@@ -1555,7 +1547,14 @@
                 <w:rStyle w:val="Hyperlink"/>
                 <w:noProof/>
               </w:rPr>
-              <w:t>4.3 Entity: Crop_Requirements</w:t>
+              <w:t xml:space="preserve">4.3 Entity: </w:t>
+            </w:r>
+            <w:r>
+              <w:rPr>
+                <w:rStyle w:val="Hyperlink"/>
+                <w:noProof/>
+              </w:rPr>
+              <w:t>Field</w:t>
             </w:r>
             <w:r>
               <w:rPr>
@@ -1616,7 +1615,14 @@
                 <w:rStyle w:val="Hyperlink"/>
                 <w:noProof/>
               </w:rPr>
-              <w:t>4.4 Entity: Crop_Plan</w:t>
+              <w:t>4.4 Entity: Crop</w:t>
+            </w:r>
+            <w:r>
+              <w:rPr>
+                <w:rStyle w:val="Hyperlink"/>
+                <w:noProof/>
+              </w:rPr>
+              <w:t>Plan</w:t>
             </w:r>
             <w:r>
               <w:rPr>
@@ -1799,7 +1805,21 @@
                 <w:rStyle w:val="Hyperlink"/>
                 <w:noProof/>
               </w:rPr>
-              <w:t>5.1 Farm Management (/Farms)</w:t>
+              <w:t>5.1 Farm Management (/Farm</w:t>
+            </w:r>
+            <w:r>
+              <w:rPr>
+                <w:rStyle w:val="Hyperlink"/>
+                <w:noProof/>
+              </w:rPr>
+              <w:t>Profile</w:t>
+            </w:r>
+            <w:r>
+              <w:rPr>
+                <w:rStyle w:val="Hyperlink"/>
+                <w:noProof/>
+              </w:rPr>
+              <w:t>)</w:t>
             </w:r>
             <w:r>
               <w:rPr>
@@ -1921,7 +1941,21 @@
                 <w:rStyle w:val="Hyperlink"/>
                 <w:noProof/>
               </w:rPr>
-              <w:t>5.3 Crop Requirements (/Crop_Requirements)</w:t>
+              <w:t>5.3 Crop Requirements (/</w:t>
+            </w:r>
+            <w:r>
+              <w:rPr>
+                <w:rStyle w:val="Hyperlink"/>
+                <w:noProof/>
+              </w:rPr>
+              <w:t>Field</w:t>
+            </w:r>
+            <w:r>
+              <w:rPr>
+                <w:rStyle w:val="Hyperlink"/>
+                <w:noProof/>
+              </w:rPr>
+              <w:t>)</w:t>
             </w:r>
             <w:r>
               <w:rPr>
@@ -1982,7 +2016,7 @@
                 <w:rStyle w:val="Hyperlink"/>
                 <w:noProof/>
               </w:rPr>
-              <w:t>5.4 Crop Planning (/Crop_Plans)</w:t>
+              <w:t>5.4 Crop Planning (/CropPlans)</w:t>
             </w:r>
             <w:r>
               <w:rPr>
@@ -2907,77 +2941,13 @@
         <w:shd w:val="clear" w:color="auto" w:fill="F2F2F2"/>
         <w:spacing w:after="120"/>
       </w:pPr>
-      <w:proofErr w:type="gramStart"/>
       <w:r>
         <w:rPr>
           <w:rFonts w:ascii="Consolas" w:eastAsia="Consolas" w:hAnsi="Consolas" w:cs="Consolas"/>
           <w:sz w:val="20"/>
           <w:szCs w:val="20"/>
         </w:rPr>
-        <w:t>Client  &gt;</w:t>
-      </w:r>
-      <w:proofErr w:type="gramEnd"/>
-      <w:r>
-        <w:rPr>
-          <w:rFonts w:ascii="Consolas" w:eastAsia="Consolas" w:hAnsi="Consolas" w:cs="Consolas"/>
-          <w:sz w:val="20"/>
-          <w:szCs w:val="20"/>
-        </w:rPr>
-        <w:t xml:space="preserve">  </w:t>
-      </w:r>
-      <w:proofErr w:type="gramStart"/>
-      <w:r>
-        <w:rPr>
-          <w:rFonts w:ascii="Consolas" w:eastAsia="Consolas" w:hAnsi="Consolas" w:cs="Consolas"/>
-          <w:sz w:val="20"/>
-          <w:szCs w:val="20"/>
-        </w:rPr>
-        <w:t>Controller  &gt;</w:t>
-      </w:r>
-      <w:proofErr w:type="gramEnd"/>
-      <w:r>
-        <w:rPr>
-          <w:rFonts w:ascii="Consolas" w:eastAsia="Consolas" w:hAnsi="Consolas" w:cs="Consolas"/>
-          <w:sz w:val="20"/>
-          <w:szCs w:val="20"/>
-        </w:rPr>
-        <w:t xml:space="preserve">  </w:t>
-      </w:r>
-      <w:proofErr w:type="gramStart"/>
-      <w:r>
-        <w:rPr>
-          <w:rFonts w:ascii="Consolas" w:eastAsia="Consolas" w:hAnsi="Consolas" w:cs="Consolas"/>
-          <w:sz w:val="20"/>
-          <w:szCs w:val="20"/>
-        </w:rPr>
-        <w:t>Service  &gt;</w:t>
-      </w:r>
-      <w:proofErr w:type="gramEnd"/>
-      <w:r>
-        <w:rPr>
-          <w:rFonts w:ascii="Consolas" w:eastAsia="Consolas" w:hAnsi="Consolas" w:cs="Consolas"/>
-          <w:sz w:val="20"/>
-          <w:szCs w:val="20"/>
-        </w:rPr>
-        <w:t xml:space="preserve">  </w:t>
-      </w:r>
-      <w:proofErr w:type="gramStart"/>
-      <w:r>
-        <w:rPr>
-          <w:rFonts w:ascii="Consolas" w:eastAsia="Consolas" w:hAnsi="Consolas" w:cs="Consolas"/>
-          <w:sz w:val="20"/>
-          <w:szCs w:val="20"/>
-        </w:rPr>
-        <w:t>Repository  &gt;</w:t>
-      </w:r>
-      <w:proofErr w:type="gramEnd"/>
-      <w:r>
-        <w:rPr>
-          <w:rFonts w:ascii="Consolas" w:eastAsia="Consolas" w:hAnsi="Consolas" w:cs="Consolas"/>
-          <w:sz w:val="20"/>
-          <w:szCs w:val="20"/>
-        </w:rPr>
-        <w:t xml:space="preserve">  Database</w:t>
+        <w:t>Client  &gt;  Controller  &gt;  Service  &gt;  Repository  &gt;  Database</w:t>
       </w:r>
     </w:p>
     <w:p>
@@ -3905,20 +3875,13 @@
             </w:tcMar>
           </w:tcPr>
           <w:p>
-            <w:r>
-              <w:rPr>
-                <w:sz w:val="20"/>
-                <w:szCs w:val="20"/>
-              </w:rPr>
-              <w:t xml:space="preserve">Farms, Crops, </w:t>
-            </w:r>
             <w:proofErr w:type="spellStart"/>
             <w:r>
               <w:rPr>
                 <w:sz w:val="20"/>
                 <w:szCs w:val="20"/>
               </w:rPr>
-              <w:t>Crop_Requirements</w:t>
+              <w:t>FarmProfile</w:t>
             </w:r>
             <w:proofErr w:type="spellEnd"/>
             <w:r>
@@ -3926,7 +3889,7 @@
                 <w:sz w:val="20"/>
                 <w:szCs w:val="20"/>
               </w:rPr>
-              <w:t xml:space="preserve">, </w:t>
+              <w:t xml:space="preserve">, Field, Crop, </w:t>
             </w:r>
             <w:proofErr w:type="spellStart"/>
             <w:r>
@@ -3934,7 +3897,7 @@
                 <w:sz w:val="20"/>
                 <w:szCs w:val="20"/>
               </w:rPr>
-              <w:t>Crop_Plan</w:t>
+              <w:t>CropPlan</w:t>
             </w:r>
             <w:proofErr w:type="spellEnd"/>
           </w:p>
@@ -3990,7 +3953,21 @@
                 <w:sz w:val="20"/>
                 <w:szCs w:val="20"/>
               </w:rPr>
-              <w:t>FarmsRepo</w:t>
+              <w:t>Farm</w:t>
+            </w:r>
+            <w:r>
+              <w:rPr>
+                <w:sz w:val="20"/>
+                <w:szCs w:val="20"/>
+              </w:rPr>
+              <w:t>Profile</w:t>
+            </w:r>
+            <w:r>
+              <w:rPr>
+                <w:sz w:val="20"/>
+                <w:szCs w:val="20"/>
+              </w:rPr>
+              <w:t>Repo</w:t>
             </w:r>
             <w:proofErr w:type="spellEnd"/>
             <w:r>
@@ -4022,7 +3999,14 @@
                 <w:sz w:val="20"/>
                 <w:szCs w:val="20"/>
               </w:rPr>
-              <w:t>Crop_RequirementRepo</w:t>
+              <w:t>Field</w:t>
+            </w:r>
+            <w:r>
+              <w:rPr>
+                <w:sz w:val="20"/>
+                <w:szCs w:val="20"/>
+              </w:rPr>
+              <w:t>Repo</w:t>
             </w:r>
             <w:proofErr w:type="spellEnd"/>
             <w:r>
@@ -4038,7 +4022,7 @@
                 <w:sz w:val="20"/>
                 <w:szCs w:val="20"/>
               </w:rPr>
-              <w:t>Crop_PlanRepo</w:t>
+              <w:t>CropPlanRepo</w:t>
             </w:r>
             <w:proofErr w:type="spellEnd"/>
           </w:p>
@@ -4094,7 +4078,21 @@
                 <w:sz w:val="20"/>
                 <w:szCs w:val="20"/>
               </w:rPr>
-              <w:t>FarmsService</w:t>
+              <w:t>Farm</w:t>
+            </w:r>
+            <w:r>
+              <w:rPr>
+                <w:sz w:val="20"/>
+                <w:szCs w:val="20"/>
+              </w:rPr>
+              <w:t>Profile</w:t>
+            </w:r>
+            <w:r>
+              <w:rPr>
+                <w:sz w:val="20"/>
+                <w:szCs w:val="20"/>
+              </w:rPr>
+              <w:t>Service</w:t>
             </w:r>
             <w:proofErr w:type="spellEnd"/>
             <w:r>
@@ -4126,7 +4124,14 @@
                 <w:sz w:val="20"/>
                 <w:szCs w:val="20"/>
               </w:rPr>
-              <w:t>Crop_RequirementService</w:t>
+              <w:t>Filed</w:t>
+            </w:r>
+            <w:r>
+              <w:rPr>
+                <w:sz w:val="20"/>
+                <w:szCs w:val="20"/>
+              </w:rPr>
+              <w:t>Service</w:t>
             </w:r>
             <w:proofErr w:type="spellEnd"/>
             <w:r>
@@ -4142,7 +4147,7 @@
                 <w:sz w:val="20"/>
                 <w:szCs w:val="20"/>
               </w:rPr>
-              <w:t>Crop_PlanService</w:t>
+              <w:t>CropPlanService</w:t>
             </w:r>
             <w:proofErr w:type="spellEnd"/>
           </w:p>
@@ -4198,7 +4203,7 @@
                 <w:sz w:val="20"/>
                 <w:szCs w:val="20"/>
               </w:rPr>
-              <w:t>FarmsController</w:t>
+              <w:t>FarmProfileController</w:t>
             </w:r>
             <w:proofErr w:type="spellEnd"/>
             <w:r>
@@ -4214,7 +4219,7 @@
                 <w:sz w:val="20"/>
                 <w:szCs w:val="20"/>
               </w:rPr>
-              <w:t>CropsController</w:t>
+              <w:t>FieldController</w:t>
             </w:r>
             <w:proofErr w:type="spellEnd"/>
             <w:r>
@@ -4230,7 +4235,7 @@
                 <w:sz w:val="20"/>
                 <w:szCs w:val="20"/>
               </w:rPr>
-              <w:t>Crop_RequirementController</w:t>
+              <w:t>CropController</w:t>
             </w:r>
             <w:proofErr w:type="spellEnd"/>
             <w:r>
@@ -4246,7 +4251,7 @@
                 <w:sz w:val="20"/>
                 <w:szCs w:val="20"/>
               </w:rPr>
-              <w:t>Crop_PlanController</w:t>
+              <w:t>CropPlanController</w:t>
             </w:r>
             <w:proofErr w:type="spellEnd"/>
           </w:p>
@@ -4277,9 +4282,17 @@
       </w:pPr>
       <w:bookmarkStart w:id="14" w:name="_Toc241668697"/>
       <w:r>
-        <w:t>4.1 Entity: Farms</w:t>
+        <w:t xml:space="preserve">4.1 Entity: </w:t>
+      </w:r>
+      <w:proofErr w:type="spellStart"/>
+      <w:r>
+        <w:t>Farm</w:t>
       </w:r>
       <w:bookmarkEnd w:id="14"/>
+      <w:r>
+        <w:t>Profile</w:t>
+      </w:r>
+      <w:proofErr w:type="spellEnd"/>
     </w:p>
     <w:tbl>
       <w:tblPr>
@@ -4586,7 +4599,6 @@
                 <w:sz w:val="20"/>
                 <w:szCs w:val="20"/>
               </w:rPr>
-              <w:lastRenderedPageBreak/>
               <w:t>farm_location</w:t>
             </w:r>
             <w:proofErr w:type="spellEnd"/>
@@ -4668,6 +4680,7 @@
                 <w:sz w:val="20"/>
                 <w:szCs w:val="20"/>
               </w:rPr>
+              <w:lastRenderedPageBreak/>
               <w:t>area</w:t>
             </w:r>
           </w:p>
@@ -5362,12 +5375,10 @@
       <w:r>
         <w:t xml:space="preserve">4.3 Entity: </w:t>
       </w:r>
-      <w:proofErr w:type="spellStart"/>
-      <w:r>
-        <w:t>Crop_Requirements</w:t>
-      </w:r>
       <w:bookmarkEnd w:id="16"/>
-      <w:proofErr w:type="spellEnd"/>
+      <w:r>
+        <w:t>Field</w:t>
+      </w:r>
     </w:p>
     <w:tbl>
       <w:tblPr>
@@ -6004,7 +6015,7 @@
       </w:r>
       <w:proofErr w:type="spellStart"/>
       <w:r>
-        <w:t>Crop_Plan</w:t>
+        <w:t>CropPlan</w:t>
       </w:r>
       <w:bookmarkEnd w:id="17"/>
       <w:proofErr w:type="spellEnd"/>
@@ -6583,22 +6594,48 @@
         <w:shd w:val="clear" w:color="auto" w:fill="F2F2F2"/>
         <w:spacing w:after="120"/>
       </w:pPr>
+      <w:proofErr w:type="spellStart"/>
       <w:r>
         <w:rPr>
           <w:rFonts w:ascii="Consolas" w:eastAsia="Consolas" w:hAnsi="Consolas" w:cs="Consolas"/>
           <w:sz w:val="20"/>
           <w:szCs w:val="20"/>
         </w:rPr>
-        <w:t xml:space="preserve">Farms 1 --- * </w:t>
-      </w:r>
-      <w:proofErr w:type="spellStart"/>
+        <w:t>Farm</w:t>
+      </w:r>
       <w:r>
         <w:rPr>
           <w:rFonts w:ascii="Consolas" w:eastAsia="Consolas" w:hAnsi="Consolas" w:cs="Consolas"/>
           <w:sz w:val="20"/>
           <w:szCs w:val="20"/>
         </w:rPr>
-        <w:t>Crop_Plan</w:t>
+        <w:t>Profile</w:t>
+      </w:r>
+      <w:proofErr w:type="spellEnd"/>
+      <w:r>
+        <w:rPr>
+          <w:rFonts w:ascii="Consolas" w:eastAsia="Consolas" w:hAnsi="Consolas" w:cs="Consolas"/>
+          <w:sz w:val="20"/>
+          <w:szCs w:val="20"/>
+        </w:rPr>
+        <w:t xml:space="preserve"> </w:t>
+      </w:r>
+      <w:r>
+        <w:rPr>
+          <w:rFonts w:ascii="Consolas" w:eastAsia="Consolas" w:hAnsi="Consolas" w:cs="Consolas"/>
+          <w:sz w:val="20"/>
+          <w:szCs w:val="20"/>
+        </w:rPr>
+        <w:t xml:space="preserve">1 --- * </w:t>
+      </w:r>
+      <w:proofErr w:type="spellStart"/>
+      <w:r>
+        <w:rPr>
+          <w:rFonts w:ascii="Consolas" w:eastAsia="Consolas" w:hAnsi="Consolas" w:cs="Consolas"/>
+          <w:sz w:val="20"/>
+          <w:szCs w:val="20"/>
+        </w:rPr>
+        <w:t>CropPlan</w:t>
       </w:r>
       <w:proofErr w:type="spellEnd"/>
       <w:r>
@@ -6609,16 +6646,14 @@
         </w:rPr>
         <w:t xml:space="preserve"> * --- 1 Crops 1 --- * </w:t>
       </w:r>
-      <w:proofErr w:type="spellStart"/>
       <w:r>
         <w:rPr>
           <w:rFonts w:ascii="Consolas" w:eastAsia="Consolas" w:hAnsi="Consolas" w:cs="Consolas"/>
           <w:sz w:val="20"/>
           <w:szCs w:val="20"/>
         </w:rPr>
-        <w:t>Crop_Requirements</w:t>
-      </w:r>
-      <w:proofErr w:type="spellEnd"/>
+        <w:t>Field</w:t>
+      </w:r>
     </w:p>
     <w:p>
       <w:pPr>
@@ -6645,7 +6680,18 @@
       </w:pPr>
       <w:bookmarkStart w:id="20" w:name="_Toc241668703"/>
       <w:r>
-        <w:t>5.1 Farm Management (/Farms)</w:t>
+        <w:t>5.1 Farm Management (/</w:t>
+      </w:r>
+      <w:proofErr w:type="spellStart"/>
+      <w:r>
+        <w:t>Farm</w:t>
+      </w:r>
+      <w:r>
+        <w:t>Profile</w:t>
+      </w:r>
+      <w:proofErr w:type="spellEnd"/>
+      <w:r>
+        <w:t>)</w:t>
       </w:r>
       <w:bookmarkEnd w:id="20"/>
     </w:p>
@@ -6841,8 +6887,24 @@
                 <w:sz w:val="20"/>
                 <w:szCs w:val="20"/>
               </w:rPr>
-              <w:t>POST /Farms</w:t>
-            </w:r>
+              <w:t>POST /</w:t>
+            </w:r>
+            <w:proofErr w:type="spellStart"/>
+            <w:r>
+              <w:rPr>
+                <w:sz w:val="20"/>
+                <w:szCs w:val="20"/>
+              </w:rPr>
+              <w:t>Farm</w:t>
+            </w:r>
+            <w:r>
+              <w:rPr>
+                <w:sz w:val="20"/>
+                <w:szCs w:val="20"/>
+              </w:rPr>
+              <w:t>Profile</w:t>
+            </w:r>
+            <w:proofErr w:type="spellEnd"/>
           </w:p>
         </w:tc>
       </w:tr>
@@ -6921,7 +6983,30 @@
                 <w:sz w:val="20"/>
                 <w:szCs w:val="20"/>
               </w:rPr>
-              <w:t>GET /Farms/all</w:t>
+              <w:t>GET /</w:t>
+            </w:r>
+            <w:proofErr w:type="spellStart"/>
+            <w:r>
+              <w:rPr>
+                <w:sz w:val="20"/>
+                <w:szCs w:val="20"/>
+              </w:rPr>
+              <w:t>Farm</w:t>
+            </w:r>
+            <w:r>
+              <w:rPr>
+                <w:sz w:val="20"/>
+                <w:szCs w:val="20"/>
+              </w:rPr>
+              <w:t>Profile</w:t>
+            </w:r>
+            <w:proofErr w:type="spellEnd"/>
+            <w:r>
+              <w:rPr>
+                <w:sz w:val="20"/>
+                <w:szCs w:val="20"/>
+              </w:rPr>
+              <w:t>/all</w:t>
             </w:r>
           </w:p>
         </w:tc>
@@ -7001,7 +7086,30 @@
                 <w:sz w:val="20"/>
                 <w:szCs w:val="20"/>
               </w:rPr>
-              <w:t>GET /Farms/{id}</w:t>
+              <w:t>GET /</w:t>
+            </w:r>
+            <w:proofErr w:type="spellStart"/>
+            <w:r>
+              <w:rPr>
+                <w:sz w:val="20"/>
+                <w:szCs w:val="20"/>
+              </w:rPr>
+              <w:t>Farm</w:t>
+            </w:r>
+            <w:r>
+              <w:rPr>
+                <w:sz w:val="20"/>
+                <w:szCs w:val="20"/>
+              </w:rPr>
+              <w:t>Profile</w:t>
+            </w:r>
+            <w:proofErr w:type="spellEnd"/>
+            <w:r>
+              <w:rPr>
+                <w:sz w:val="20"/>
+                <w:szCs w:val="20"/>
+              </w:rPr>
+              <w:t>/{id}</w:t>
             </w:r>
           </w:p>
         </w:tc>
@@ -7081,7 +7189,30 @@
                 <w:sz w:val="20"/>
                 <w:szCs w:val="20"/>
               </w:rPr>
-              <w:t>DELETE /Farms/all (see 8.1)</w:t>
+              <w:t>DELETE /</w:t>
+            </w:r>
+            <w:proofErr w:type="spellStart"/>
+            <w:r>
+              <w:rPr>
+                <w:sz w:val="20"/>
+                <w:szCs w:val="20"/>
+              </w:rPr>
+              <w:t>Farm</w:t>
+            </w:r>
+            <w:r>
+              <w:rPr>
+                <w:sz w:val="20"/>
+                <w:szCs w:val="20"/>
+              </w:rPr>
+              <w:t>Profile</w:t>
+            </w:r>
+            <w:proofErr w:type="spellEnd"/>
+            <w:r>
+              <w:rPr>
+                <w:sz w:val="20"/>
+                <w:szCs w:val="20"/>
+              </w:rPr>
+              <w:t>/all (see 8.1)</w:t>
             </w:r>
           </w:p>
         </w:tc>
@@ -7553,11 +7684,9 @@
       <w:r>
         <w:t>5.3 Crop Requirements (/</w:t>
       </w:r>
-      <w:proofErr w:type="spellStart"/>
-      <w:r>
-        <w:t>Crop_Requirements</w:t>
-      </w:r>
-      <w:proofErr w:type="spellEnd"/>
+      <w:r>
+        <w:t>Field</w:t>
+      </w:r>
       <w:r>
         <w:t>)</w:t>
       </w:r>
@@ -7757,15 +7886,13 @@
               </w:rPr>
               <w:t>POST /</w:t>
             </w:r>
-            <w:proofErr w:type="spellStart"/>
-            <w:r>
-              <w:rPr>
-                <w:sz w:val="20"/>
-                <w:szCs w:val="20"/>
-              </w:rPr>
-              <w:t>Crop_Requirements</w:t>
-            </w:r>
-            <w:proofErr w:type="spellEnd"/>
+            <w:r>
+              <w:rPr>
+                <w:sz w:val="20"/>
+                <w:szCs w:val="20"/>
+              </w:rPr>
+              <w:t>Field</w:t>
+            </w:r>
           </w:p>
         </w:tc>
       </w:tr>
@@ -7846,15 +7973,27 @@
               </w:rPr>
               <w:t>GET /</w:t>
             </w:r>
-            <w:proofErr w:type="spellStart"/>
-            <w:r>
-              <w:rPr>
-                <w:sz w:val="20"/>
-                <w:szCs w:val="20"/>
-              </w:rPr>
-              <w:t>Crop_Requirements</w:t>
-            </w:r>
-            <w:proofErr w:type="spellEnd"/>
+            <w:r>
+              <w:rPr>
+                <w:sz w:val="20"/>
+                <w:szCs w:val="20"/>
+              </w:rPr>
+              <w:t xml:space="preserve"> </w:t>
+            </w:r>
+            <w:r>
+              <w:rPr>
+                <w:sz w:val="20"/>
+                <w:szCs w:val="20"/>
+              </w:rPr>
+              <w:t>Field</w:t>
+            </w:r>
+            <w:r>
+              <w:rPr>
+                <w:sz w:val="20"/>
+                <w:szCs w:val="20"/>
+              </w:rPr>
+              <w:t xml:space="preserve"> </w:t>
+            </w:r>
             <w:r>
               <w:rPr>
                 <w:sz w:val="20"/>
@@ -7942,15 +8081,27 @@
               </w:rPr>
               <w:t>GET /</w:t>
             </w:r>
-            <w:proofErr w:type="spellStart"/>
-            <w:r>
-              <w:rPr>
-                <w:sz w:val="20"/>
-                <w:szCs w:val="20"/>
-              </w:rPr>
-              <w:t>Crop_Requirements</w:t>
-            </w:r>
-            <w:proofErr w:type="spellEnd"/>
+            <w:r>
+              <w:rPr>
+                <w:sz w:val="20"/>
+                <w:szCs w:val="20"/>
+              </w:rPr>
+              <w:t xml:space="preserve"> </w:t>
+            </w:r>
+            <w:r>
+              <w:rPr>
+                <w:sz w:val="20"/>
+                <w:szCs w:val="20"/>
+              </w:rPr>
+              <w:t>Field</w:t>
+            </w:r>
+            <w:r>
+              <w:rPr>
+                <w:sz w:val="20"/>
+                <w:szCs w:val="20"/>
+              </w:rPr>
+              <w:t xml:space="preserve"> </w:t>
+            </w:r>
             <w:r>
               <w:rPr>
                 <w:sz w:val="20"/>
@@ -8038,15 +8189,27 @@
               </w:rPr>
               <w:t>DELETE /</w:t>
             </w:r>
-            <w:proofErr w:type="spellStart"/>
-            <w:r>
-              <w:rPr>
-                <w:sz w:val="20"/>
-                <w:szCs w:val="20"/>
-              </w:rPr>
-              <w:t>Crop_Requirements</w:t>
-            </w:r>
-            <w:proofErr w:type="spellEnd"/>
+            <w:r>
+              <w:rPr>
+                <w:sz w:val="20"/>
+                <w:szCs w:val="20"/>
+              </w:rPr>
+              <w:t xml:space="preserve"> </w:t>
+            </w:r>
+            <w:r>
+              <w:rPr>
+                <w:sz w:val="20"/>
+                <w:szCs w:val="20"/>
+              </w:rPr>
+              <w:t>Field</w:t>
+            </w:r>
+            <w:r>
+              <w:rPr>
+                <w:sz w:val="20"/>
+                <w:szCs w:val="20"/>
+              </w:rPr>
+              <w:t xml:space="preserve"> </w:t>
+            </w:r>
             <w:r>
               <w:rPr>
                 <w:sz w:val="20"/>
@@ -8073,7 +8236,7 @@
       </w:r>
       <w:proofErr w:type="spellStart"/>
       <w:r>
-        <w:t>Crop_Plans</w:t>
+        <w:t>CropPlans</w:t>
       </w:r>
       <w:proofErr w:type="spellEnd"/>
       <w:r>
@@ -8281,7 +8444,7 @@
                 <w:sz w:val="20"/>
                 <w:szCs w:val="20"/>
               </w:rPr>
-              <w:t>Crop_Plans</w:t>
+              <w:t>CropPlans</w:t>
             </w:r>
             <w:proofErr w:type="spellEnd"/>
           </w:p>
@@ -8370,7 +8533,7 @@
                 <w:sz w:val="20"/>
                 <w:szCs w:val="20"/>
               </w:rPr>
-              <w:t>Crop_Plans</w:t>
+              <w:t>CropPlans</w:t>
             </w:r>
             <w:proofErr w:type="spellEnd"/>
             <w:r>
@@ -8466,7 +8629,7 @@
                 <w:sz w:val="20"/>
                 <w:szCs w:val="20"/>
               </w:rPr>
-              <w:t>Crop_Plans</w:t>
+              <w:t>CropPlans</w:t>
             </w:r>
             <w:proofErr w:type="spellEnd"/>
             <w:r>
@@ -8562,7 +8725,7 @@
                 <w:sz w:val="20"/>
                 <w:szCs w:val="20"/>
               </w:rPr>
-              <w:t>Crop_Plans</w:t>
+              <w:t>CropPlans</w:t>
             </w:r>
             <w:proofErr w:type="spellEnd"/>
             <w:r>
@@ -9590,7 +9753,13 @@
       </w:pPr>
       <w:proofErr w:type="spellStart"/>
       <w:r>
-        <w:t>FarmsController.delete</w:t>
+        <w:t>Farm</w:t>
+      </w:r>
+      <w:r>
+        <w:t>Profile</w:t>
+      </w:r>
+      <w:r>
+        <w:t>Controller.delete</w:t>
       </w:r>
       <w:proofErr w:type="spellEnd"/>
       <w:r>
@@ -9616,7 +9785,13 @@
       </w:pPr>
       <w:proofErr w:type="spellStart"/>
       <w:r>
-        <w:t>FarmsController.saveCrops</w:t>
+        <w:t>Farm</w:t>
+      </w:r>
+      <w:r>
+        <w:t>Profile</w:t>
+      </w:r>
+      <w:r>
+        <w:t>Controller.saveCrops</w:t>
       </w:r>
       <w:proofErr w:type="spellEnd"/>
       <w:r>
@@ -9643,11 +9818,9 @@
       <w:r>
         <w:t>Bulk-delete endpoints (DELETE /Crops/all, DELETE /</w:t>
       </w:r>
-      <w:proofErr w:type="spellStart"/>
-      <w:r>
-        <w:t>Crop_Requirements</w:t>
-      </w:r>
-      <w:proofErr w:type="spellEnd"/>
+      <w:r>
+        <w:t>Field</w:t>
+      </w:r>
       <w:r>
         <w:t>/all) remove all data with no confirmation or authorisation. Replace them with DELETE /{id}.</w:t>
       </w:r>
@@ -9740,7 +9913,7 @@
       </w:r>
       <w:proofErr w:type="spellStart"/>
       <w:r>
-        <w:t>Crop_Plan</w:t>
+        <w:t>CropPlan</w:t>
       </w:r>
       <w:proofErr w:type="spellEnd"/>
       <w:r>
@@ -10051,8 +10224,24 @@
                 <w:sz w:val="20"/>
                 <w:szCs w:val="20"/>
               </w:rPr>
-              <w:t>/Farms</w:t>
-            </w:r>
+              <w:t>/</w:t>
+            </w:r>
+            <w:proofErr w:type="spellStart"/>
+            <w:r>
+              <w:rPr>
+                <w:sz w:val="20"/>
+                <w:szCs w:val="20"/>
+              </w:rPr>
+              <w:t>Farm</w:t>
+            </w:r>
+            <w:r>
+              <w:rPr>
+                <w:sz w:val="20"/>
+                <w:szCs w:val="20"/>
+              </w:rPr>
+              <w:t>Profile</w:t>
+            </w:r>
+            <w:proofErr w:type="spellEnd"/>
           </w:p>
         </w:tc>
         <w:tc>
@@ -10103,17 +10292,8 @@
                 <w:sz w:val="20"/>
                 <w:szCs w:val="20"/>
               </w:rPr>
-              <w:t>/</w:t>
-            </w:r>
-            <w:proofErr w:type="gramStart"/>
-            <w:r>
-              <w:rPr>
-                <w:sz w:val="20"/>
-                <w:szCs w:val="20"/>
-              </w:rPr>
-              <w:t>all</w:t>
-            </w:r>
-            <w:proofErr w:type="gramEnd"/>
+              <w:t>/all</w:t>
+            </w:r>
           </w:p>
         </w:tc>
         <w:tc>
@@ -10164,23 +10344,7 @@
                 <w:sz w:val="20"/>
                 <w:szCs w:val="20"/>
               </w:rPr>
-              <w:t>/</w:t>
-            </w:r>
-            <w:proofErr w:type="gramStart"/>
-            <w:r>
-              <w:rPr>
-                <w:sz w:val="20"/>
-                <w:szCs w:val="20"/>
-              </w:rPr>
-              <w:t>all</w:t>
-            </w:r>
-            <w:proofErr w:type="gramEnd"/>
-            <w:r>
-              <w:rPr>
-                <w:sz w:val="20"/>
-                <w:szCs w:val="20"/>
-              </w:rPr>
-              <w:t xml:space="preserve"> (needs fix)</w:t>
+              <w:t>/all (needs fix)</w:t>
             </w:r>
           </w:p>
         </w:tc>
@@ -10260,17 +10424,8 @@
                 <w:sz w:val="20"/>
                 <w:szCs w:val="20"/>
               </w:rPr>
-              <w:t>/</w:t>
-            </w:r>
-            <w:proofErr w:type="gramStart"/>
-            <w:r>
-              <w:rPr>
-                <w:sz w:val="20"/>
-                <w:szCs w:val="20"/>
-              </w:rPr>
-              <w:t>all</w:t>
-            </w:r>
-            <w:proofErr w:type="gramEnd"/>
+              <w:t>/all</w:t>
+            </w:r>
           </w:p>
         </w:tc>
         <w:tc>
@@ -10321,23 +10476,7 @@
                 <w:sz w:val="20"/>
                 <w:szCs w:val="20"/>
               </w:rPr>
-              <w:t>/</w:t>
-            </w:r>
-            <w:proofErr w:type="gramStart"/>
-            <w:r>
-              <w:rPr>
-                <w:sz w:val="20"/>
-                <w:szCs w:val="20"/>
-              </w:rPr>
-              <w:t>all</w:t>
-            </w:r>
-            <w:proofErr w:type="gramEnd"/>
-            <w:r>
-              <w:rPr>
-                <w:sz w:val="20"/>
-                <w:szCs w:val="20"/>
-              </w:rPr>
-              <w:t xml:space="preserve"> (deletes all)</w:t>
+              <w:t>/all (deletes all)</w:t>
             </w:r>
           </w:p>
         </w:tc>
@@ -10367,15 +10506,13 @@
               </w:rPr>
               <w:t>/</w:t>
             </w:r>
-            <w:proofErr w:type="spellStart"/>
-            <w:r>
-              <w:rPr>
-                <w:sz w:val="20"/>
-                <w:szCs w:val="20"/>
-              </w:rPr>
-              <w:t>Crop_Requirements</w:t>
-            </w:r>
-            <w:proofErr w:type="spellEnd"/>
+            <w:r>
+              <w:rPr>
+                <w:sz w:val="20"/>
+                <w:szCs w:val="20"/>
+              </w:rPr>
+              <w:t>Field</w:t>
+            </w:r>
           </w:p>
         </w:tc>
         <w:tc>
@@ -10426,17 +10563,8 @@
                 <w:sz w:val="20"/>
                 <w:szCs w:val="20"/>
               </w:rPr>
-              <w:t>/</w:t>
-            </w:r>
-            <w:proofErr w:type="gramStart"/>
-            <w:r>
-              <w:rPr>
-                <w:sz w:val="20"/>
-                <w:szCs w:val="20"/>
-              </w:rPr>
-              <w:t>all</w:t>
-            </w:r>
-            <w:proofErr w:type="gramEnd"/>
+              <w:t>/all</w:t>
+            </w:r>
           </w:p>
         </w:tc>
         <w:tc>
@@ -10487,23 +10615,7 @@
                 <w:sz w:val="20"/>
                 <w:szCs w:val="20"/>
               </w:rPr>
-              <w:t>/</w:t>
-            </w:r>
-            <w:proofErr w:type="gramStart"/>
-            <w:r>
-              <w:rPr>
-                <w:sz w:val="20"/>
-                <w:szCs w:val="20"/>
-              </w:rPr>
-              <w:t>all</w:t>
-            </w:r>
-            <w:proofErr w:type="gramEnd"/>
-            <w:r>
-              <w:rPr>
-                <w:sz w:val="20"/>
-                <w:szCs w:val="20"/>
-              </w:rPr>
-              <w:t xml:space="preserve"> (deletes all)</w:t>
+              <w:t>/all (deletes all)</w:t>
             </w:r>
           </w:p>
         </w:tc>
@@ -10539,7 +10651,7 @@
                 <w:sz w:val="20"/>
                 <w:szCs w:val="20"/>
               </w:rPr>
-              <w:t>Crop_Plans</w:t>
+              <w:t>CropPlans</w:t>
             </w:r>
             <w:proofErr w:type="spellEnd"/>
           </w:p>
@@ -10592,17 +10704,8 @@
                 <w:sz w:val="20"/>
                 <w:szCs w:val="20"/>
               </w:rPr>
-              <w:t>/</w:t>
-            </w:r>
-            <w:proofErr w:type="gramStart"/>
-            <w:r>
-              <w:rPr>
-                <w:sz w:val="20"/>
-                <w:szCs w:val="20"/>
-              </w:rPr>
-              <w:t>all</w:t>
-            </w:r>
-            <w:proofErr w:type="gramEnd"/>
+              <w:t>/all</w:t>
+            </w:r>
           </w:p>
         </w:tc>
         <w:tc>
@@ -10712,25 +10815,7 @@
         <w:sz w:val="18"/>
         <w:szCs w:val="18"/>
       </w:rPr>
-      <w:t xml:space="preserve"> </w:t>
-    </w:r>
-    <w:proofErr w:type="gramStart"/>
-    <w:r>
-      <w:rPr>
-        <w:color w:val="7F7F7F"/>
-        <w:sz w:val="18"/>
-        <w:szCs w:val="18"/>
-      </w:rPr>
-      <w:t>SRS  |</w:t>
-    </w:r>
-    <w:proofErr w:type="gramEnd"/>
-    <w:r>
-      <w:rPr>
-        <w:color w:val="7F7F7F"/>
-        <w:sz w:val="18"/>
-        <w:szCs w:val="18"/>
-      </w:rPr>
-      <w:t xml:space="preserve">  Page </w:t>
+      <w:t xml:space="preserve"> SRS  |  Page </w:t>
     </w:r>
     <w:r>
       <w:rPr>
@@ -11500,7 +11585,6 @@
   <w:style w:type="character" w:default="1" w:styleId="DefaultParagraphFont">
     <w:name w:val="Default Paragraph Font"/>
     <w:uiPriority w:val="1"/>
-    <w:semiHidden/>
     <w:unhideWhenUsed/>
   </w:style>
   <w:style w:type="table" w:default="1" w:styleId="TableNormal">

</xml_diff>